<commit_message>
[CIB]: Continuado brevemente con la práctica hashcat.
</commit_message>
<xml_diff>
--- a/CIB/UD1/1.2_Practica_Hashcat_WiFi/Practica_Hashcat_WiFi.docx
+++ b/CIB/UD1/1.2_Practica_Hashcat_WiFi/Practica_Hashcat_WiFi.docx
@@ -62,7 +62,7 @@
         <w:pStyle w:val="Normal"/>
         <w:numPr>
           <w:ilvl w:val="0"/>
-          <w:numId w:val="7"/>
+          <w:numId w:val="4"/>
         </w:numPr>
         <w:spacing w:before="0" w:after="150"/>
         <w:rPr/>
@@ -77,7 +77,7 @@
         <w:pStyle w:val="Normal"/>
         <w:numPr>
           <w:ilvl w:val="0"/>
-          <w:numId w:val="7"/>
+          <w:numId w:val="4"/>
         </w:numPr>
         <w:spacing w:before="0" w:after="150"/>
         <w:rPr/>
@@ -92,7 +92,7 @@
         <w:pStyle w:val="Normal"/>
         <w:numPr>
           <w:ilvl w:val="0"/>
-          <w:numId w:val="7"/>
+          <w:numId w:val="4"/>
         </w:numPr>
         <w:spacing w:before="0" w:after="150"/>
         <w:rPr/>
@@ -107,7 +107,7 @@
         <w:pStyle w:val="Normal"/>
         <w:numPr>
           <w:ilvl w:val="0"/>
-          <w:numId w:val="7"/>
+          <w:numId w:val="4"/>
         </w:numPr>
         <w:spacing w:before="0" w:after="150"/>
         <w:rPr/>
@@ -122,7 +122,7 @@
         <w:pStyle w:val="Normal"/>
         <w:numPr>
           <w:ilvl w:val="0"/>
-          <w:numId w:val="7"/>
+          <w:numId w:val="4"/>
         </w:numPr>
         <w:spacing w:before="0" w:after="150"/>
         <w:rPr/>
@@ -182,7 +182,9 @@
         </w:rPr>
       </w:pPr>
       <w:r>
-        <w:rPr/>
+        <w:rPr>
+          <w:rFonts w:eastAsia="Consolas" w:cs="Consolas" w:ascii="Consolas" w:hAnsi="Consolas"/>
+        </w:rPr>
         <w:drawing>
           <wp:anchor distT="0" distB="0" distL="0" distR="0" simplePos="0" relativeHeight="2" behindDoc="0" locked="0" layoutInCell="0" allowOverlap="1">
             <wp:simplePos x="0" y="0"/>
@@ -296,23 +298,7 @@
       </w:pPr>
       <w:r>
         <w:rPr/>
-        <w:t xml:space="preserve">En lugar de escribir las 20-30 variaciones a mano, </w:t>
-      </w:r>
-      <w:r>
-        <w:rPr/>
-        <w:t>mediante el uso de tres palabras (año, centro y nombre)</w:t>
-      </w:r>
-      <w:r>
-        <w:rPr/>
-        <w:t xml:space="preserve"> Hashcat gener</w:t>
-      </w:r>
-      <w:r>
-        <w:rPr/>
-        <w:t>a</w:t>
-      </w:r>
-      <w:r>
-        <w:rPr/>
-        <w:t xml:space="preserve"> automáticamente un montón de variaciones aplicando un archivo de reglas sobre esas palabras:</w:t>
+        <w:t>En lugar de escribir las 20-30 variaciones a mano, mediante el uso de tres palabras (año, centro y nombre) Hashcat genera automáticamente un montón de variaciones aplicando un archivo de reglas sobre esas palabras:</w:t>
       </w:r>
     </w:p>
     <w:p>
@@ -337,39 +323,7 @@
           <w:b/>
           <w:bCs/>
         </w:rPr>
-        <w:t xml:space="preserve">hashcat --stdout -r rules/best66.rule </w:t>
-      </w:r>
-      <w:r>
-        <w:rPr>
-          <w:rFonts w:ascii="Consolas" w:hAnsi="Consolas"/>
-          <w:b/>
-          <w:bCs/>
-        </w:rPr>
-        <w:t>Archivos/</w:t>
-      </w:r>
-      <w:r>
-        <w:rPr>
-          <w:rFonts w:ascii="Consolas" w:hAnsi="Consolas"/>
-          <w:b/>
-          <w:bCs/>
-        </w:rPr>
-        <w:t xml:space="preserve">palabras.txt &gt; </w:t>
-      </w:r>
-      <w:r>
-        <w:rPr>
-          <w:rFonts w:ascii="Consolas" w:hAnsi="Consolas"/>
-          <w:b/>
-          <w:bCs/>
-        </w:rPr>
-        <w:t>Archivos/</w:t>
-      </w:r>
-      <w:r>
-        <w:rPr>
-          <w:rFonts w:ascii="Consolas" w:hAnsi="Consolas"/>
-          <w:b/>
-          <w:bCs/>
-        </w:rPr>
-        <w:t>diccionario.txt</w:t>
+        <w:t>hashcat --stdout -r rules/best66.rule Archivos/palabras.txt &gt; Archivos/diccionario.txt</w:t>
       </w:r>
     </w:p>
     <w:p>
@@ -477,7 +431,7 @@
             <wp:positionV relativeFrom="paragraph">
               <wp:posOffset>26035</wp:posOffset>
             </wp:positionV>
-            <wp:extent cx="2165985" cy="1976755"/>
+            <wp:extent cx="2596515" cy="2369820"/>
             <wp:effectExtent l="0" t="0" r="0" b="0"/>
             <wp:wrapTopAndBottom/>
             <wp:docPr id="3" name="Imagen3"/>
@@ -502,7 +456,7 @@
                   <pic:spPr bwMode="auto">
                     <a:xfrm>
                       <a:off x="0" y="0"/>
-                      <a:ext cx="2165985" cy="1976755"/>
+                      <a:ext cx="2596515" cy="2369820"/>
                     </a:xfrm>
                     <a:prstGeom prst="rect">
                       <a:avLst/>
@@ -518,12 +472,12 @@
           <wp:anchor distT="0" distB="0" distL="0" distR="0" simplePos="0" relativeHeight="5" behindDoc="0" locked="0" layoutInCell="0" allowOverlap="1">
             <wp:simplePos x="0" y="0"/>
             <wp:positionH relativeFrom="column">
-              <wp:posOffset>3623945</wp:posOffset>
+              <wp:posOffset>3120390</wp:posOffset>
             </wp:positionH>
             <wp:positionV relativeFrom="paragraph">
-              <wp:posOffset>-59055</wp:posOffset>
+              <wp:posOffset>635</wp:posOffset>
             </wp:positionV>
-            <wp:extent cx="2084070" cy="1923415"/>
+            <wp:extent cx="2587625" cy="2388235"/>
             <wp:effectExtent l="0" t="0" r="0" b="0"/>
             <wp:wrapTopAndBottom/>
             <wp:docPr id="4" name="Imagen4"/>
@@ -548,7 +502,7 @@
                   <pic:spPr bwMode="auto">
                     <a:xfrm>
                       <a:off x="0" y="0"/>
-                      <a:ext cx="2084070" cy="1923415"/>
+                      <a:ext cx="2587625" cy="2388235"/>
                     </a:xfrm>
                     <a:prstGeom prst="rect">
                       <a:avLst/>
@@ -581,27 +535,7 @@
       </w:pPr>
       <w:r>
         <w:rPr/>
-        <w:t>Una vez el diccionario echo, mediante el uso de</w:t>
-      </w:r>
-      <w:r>
-        <w:rPr/>
-        <w:t xml:space="preserve"> Hashcat, </w:t>
-      </w:r>
-      <w:r>
-        <w:rPr/>
-        <w:t>se atacarán</w:t>
-      </w:r>
-      <w:r>
-        <w:rPr/>
-        <w:t xml:space="preserve"> los hashes utilizando </w:t>
-      </w:r>
-      <w:r>
-        <w:rPr/>
-        <w:t>los siguientes comandos</w:t>
-      </w:r>
-      <w:r>
-        <w:rPr/>
-        <w:t xml:space="preserve">: </w:t>
+        <w:t xml:space="preserve">Una vez el diccionario echo, mediante el uso de Hashcat, se atacarán los hashes utilizando los siguientes comandos: </w:t>
       </w:r>
       <w:r>
         <w:rPr>
@@ -609,39 +543,7 @@
           <w:b/>
           <w:bCs/>
         </w:rPr>
-        <w:t xml:space="preserve">hashcat -m 0 </w:t>
-      </w:r>
-      <w:r>
-        <w:rPr>
-          <w:rFonts w:eastAsia="Consolas" w:cs="Consolas" w:ascii="Consolas" w:hAnsi="Consolas"/>
-          <w:b/>
-          <w:bCs/>
-        </w:rPr>
-        <w:t>Archivos/psw_hashJ</w:t>
-      </w:r>
-      <w:r>
-        <w:rPr>
-          <w:rFonts w:eastAsia="Consolas" w:cs="Consolas" w:ascii="Consolas" w:hAnsi="Consolas"/>
-          <w:b/>
-          <w:bCs/>
-        </w:rPr>
-        <w:t xml:space="preserve">.txt </w:t>
-      </w:r>
-      <w:r>
-        <w:rPr>
-          <w:rFonts w:eastAsia="Consolas" w:cs="Consolas" w:ascii="Consolas" w:hAnsi="Consolas"/>
-          <w:b/>
-          <w:bCs/>
-        </w:rPr>
-        <w:t>Archivos/</w:t>
-      </w:r>
-      <w:r>
-        <w:rPr>
-          <w:rFonts w:eastAsia="Consolas" w:cs="Consolas" w:ascii="Consolas" w:hAnsi="Consolas"/>
-          <w:b/>
-          <w:bCs/>
-        </w:rPr>
-        <w:t>diccionario.txt</w:t>
+        <w:t>hashcat -m 0 Archivos/psw_hashJ.txt Archivos/diccionario.txt</w:t>
       </w:r>
     </w:p>
     <w:p>
@@ -750,7 +652,9 @@
         </w:rPr>
       </w:pPr>
       <w:r>
-        <w:rPr/>
+        <w:rPr>
+          <w:lang w:val="en-US"/>
+        </w:rPr>
         <w:drawing>
           <wp:anchor distT="0" distB="0" distL="0" distR="0" simplePos="0" relativeHeight="7" behindDoc="0" locked="0" layoutInCell="0" allowOverlap="1">
             <wp:simplePos x="0" y="0"/>
@@ -804,7 +708,7 @@
         <w:pStyle w:val="ListParagraph"/>
         <w:numPr>
           <w:ilvl w:val="0"/>
-          <w:numId w:val="4"/>
+          <w:numId w:val="1"/>
         </w:numPr>
         <w:spacing w:before="0" w:after="80"/>
         <w:rPr/>
@@ -814,22 +718,11 @@
           <w:b/>
           <w:bCs/>
         </w:rPr>
-        <w:t>¿</w:t>
-      </w:r>
-      <w:r>
-        <w:rPr>
-          <w:b/>
-          <w:bCs/>
-        </w:rPr>
-        <w:t>Qué contraseñas se han recuperado?</w:t>
-      </w:r>
-      <w:r>
-        <w:rPr/>
-        <w:t xml:space="preserve"> </w:t>
-      </w:r>
-      <w:r>
-        <w:rPr/>
-        <w:t>Ninguna.</w:t>
+        <w:t>¿Qué contraseñas se han recuperado?</w:t>
+      </w:r>
+      <w:r>
+        <w:rPr/>
+        <w:t xml:space="preserve"> Ninguna.</w:t>
       </w:r>
     </w:p>
     <w:p>
@@ -837,7 +730,7 @@
         <w:pStyle w:val="ListParagraph"/>
         <w:numPr>
           <w:ilvl w:val="0"/>
-          <w:numId w:val="4"/>
+          <w:numId w:val="1"/>
         </w:numPr>
         <w:spacing w:before="0" w:after="80"/>
         <w:rPr>
@@ -850,14 +743,7 @@
           <w:b/>
           <w:bCs/>
         </w:rPr>
-        <w:t>¿</w:t>
-      </w:r>
-      <w:r>
-        <w:rPr>
-          <w:b/>
-          <w:bCs/>
-        </w:rPr>
-        <w:t xml:space="preserve">Cuáles no? </w:t>
+        <w:t xml:space="preserve">¿Cuáles no? </w:t>
       </w:r>
       <w:r>
         <w:rPr>
@@ -872,7 +758,7 @@
         <w:pStyle w:val="ListParagraph"/>
         <w:numPr>
           <w:ilvl w:val="0"/>
-          <w:numId w:val="4"/>
+          <w:numId w:val="1"/>
         </w:numPr>
         <w:spacing w:before="0" w:after="80"/>
         <w:rPr/>
@@ -882,22 +768,11 @@
           <w:b/>
           <w:bCs/>
         </w:rPr>
-        <w:t>¿</w:t>
-      </w:r>
-      <w:r>
-        <w:rPr>
-          <w:b/>
-          <w:bCs/>
-        </w:rPr>
-        <w:t>Por qué creéis que ocurre?</w:t>
-      </w:r>
-      <w:r>
-        <w:rPr/>
-        <w:t xml:space="preserve"> </w:t>
-      </w:r>
-      <w:r>
-        <w:rPr/>
-        <w:t>Podría ser por longitud o por que las palabras utilizadas para generar el diccionario no han sido las correctas.</w:t>
+        <w:t>¿Por qué creéis que ocurre?</w:t>
+      </w:r>
+      <w:r>
+        <w:rPr/>
+        <w:t xml:space="preserve"> Podría ser por longitud o por que las palabras utilizadas para generar el diccionario no han sido las correctas.</w:t>
       </w:r>
     </w:p>
     <w:p>
@@ -1035,8 +910,15 @@
         <w:rPr/>
       </w:pPr>
       <w:r>
-        <w:rPr/>
+        <w:rPr>
+          <w:b/>
+          <w:bCs/>
+        </w:rPr>
         <w:t>¿Se ha recuperado alguna contraseña que antes no aparecía?</w:t>
+      </w:r>
+      <w:r>
+        <w:rPr/>
+        <w:t xml:space="preserve"> starfish.</w:t>
       </w:r>
     </w:p>
     <w:p>
@@ -1050,8 +932,19 @@
         <w:rPr/>
       </w:pPr>
       <w:r>
-        <w:rPr/>
+        <w:rPr>
+          <w:b/>
+          <w:bCs/>
+        </w:rPr>
         <w:t>¿Por qué un diccionario grande puede ser más efectivo?</w:t>
+      </w:r>
+      <w:r>
+        <w:rPr/>
+        <w:t xml:space="preserve"> </w:t>
+      </w:r>
+      <w:r>
+        <w:rPr/>
+        <w:t>Por que tiene guardadas contraseñas comunes y sus combinaciones.</w:t>
       </w:r>
     </w:p>
     <w:p>
@@ -1065,8 +958,19 @@
         <w:rPr/>
       </w:pPr>
       <w:r>
-        <w:rPr/>
+        <w:rPr>
+          <w:b/>
+          <w:bCs/>
+        </w:rPr>
         <w:t>¿Una contraseña larga es necesariamente segura frente a un ataque de diccionario?</w:t>
+      </w:r>
+      <w:r>
+        <w:rPr/>
+        <w:t xml:space="preserve"> </w:t>
+      </w:r>
+      <w:r>
+        <w:rPr/>
+        <w:t>En caso de que sea una combinación o una contraseña muy común, no será segura. Si tiene distintos tipos de caracteres, mayúsculas y minucias será segura. Aun que a día de hoy con la implementación de la IA en tema de la civerseguridad, en caso de ser una combinación de palabras de información muy básica del usuario, sería fácil de obtener. Ya que hay mucha información pública nuestra en la red.</w:t>
       </w:r>
     </w:p>
     <w:p>
@@ -1077,11 +981,77 @@
           <w:numId w:val="5"/>
         </w:numPr>
         <w:spacing w:before="0" w:after="80"/>
-        <w:rPr/>
-      </w:pPr>
-      <w:r>
-        <w:rPr/>
-        <w:t>¿Qué características debería tener una contraseña para dificultar este tipo de ataque?</w:t>
+        <w:rPr>
+          <w:b/>
+          <w:bCs/>
+        </w:rPr>
+      </w:pPr>
+      <w:r>
+        <w:rPr>
+          <w:b/>
+          <w:bCs/>
+        </w:rPr>
+        <w:t xml:space="preserve">¿Qué características debería tener una contraseña para dificultar este tipo de ataque? </w:t>
+      </w:r>
+    </w:p>
+    <w:p>
+      <w:pPr>
+        <w:pStyle w:val="ListParagraph"/>
+        <w:numPr>
+          <w:ilvl w:val="1"/>
+          <w:numId w:val="7"/>
+        </w:numPr>
+        <w:spacing w:before="0" w:after="80"/>
+        <w:rPr/>
+      </w:pPr>
+      <w:r>
+        <w:rPr/>
+        <w:t>Longitud.</w:t>
+      </w:r>
+    </w:p>
+    <w:p>
+      <w:pPr>
+        <w:pStyle w:val="ListParagraph"/>
+        <w:numPr>
+          <w:ilvl w:val="1"/>
+          <w:numId w:val="7"/>
+        </w:numPr>
+        <w:spacing w:before="0" w:after="80"/>
+        <w:rPr/>
+      </w:pPr>
+      <w:r>
+        <w:rPr/>
+        <w:t>Alternar mayúsculas y minúsculas.</w:t>
+      </w:r>
+    </w:p>
+    <w:p>
+      <w:pPr>
+        <w:pStyle w:val="ListParagraph"/>
+        <w:numPr>
+          <w:ilvl w:val="1"/>
+          <w:numId w:val="7"/>
+        </w:numPr>
+        <w:spacing w:before="0" w:after="80"/>
+        <w:rPr/>
+      </w:pPr>
+      <w:r>
+        <w:rPr/>
+        <w:t>Utilizar números.</w:t>
+      </w:r>
+    </w:p>
+    <w:p>
+      <w:pPr>
+        <w:pStyle w:val="ListParagraph"/>
+        <w:numPr>
+          <w:ilvl w:val="1"/>
+          <w:numId w:val="7"/>
+        </w:numPr>
+        <w:spacing w:before="0" w:after="80"/>
+        <w:rPr/>
+      </w:pPr>
+      <w:r>
+        <w:rPr/>
+        <w:t>Caracteres complejos.</w:t>
       </w:r>
     </w:p>
     <w:p>
@@ -1145,7 +1115,7 @@
         <w:pStyle w:val="ListParagraph"/>
         <w:numPr>
           <w:ilvl w:val="0"/>
-          <w:numId w:val="4"/>
+          <w:numId w:val="1"/>
         </w:numPr>
         <w:spacing w:before="0" w:after="80"/>
         <w:rPr/>
@@ -1155,26 +1125,11 @@
           <w:b/>
           <w:bCs/>
         </w:rPr>
-        <w:t>¿</w:t>
-      </w:r>
-      <w:r>
-        <w:rPr>
-          <w:b/>
-          <w:bCs/>
-        </w:rPr>
-        <w:t>Qué contraseñas se han recuperado?</w:t>
-      </w:r>
-      <w:r>
-        <w:rPr/>
-        <w:t xml:space="preserve"> </w:t>
-      </w:r>
-      <w:r>
-        <w:rPr/>
-        <w:t>starfish</w:t>
-      </w:r>
-      <w:r>
-        <w:rPr/>
-        <w:t>.</w:t>
+        <w:t>¿Qué contraseñas se han recuperado?</w:t>
+      </w:r>
+      <w:r>
+        <w:rPr/>
+        <w:t xml:space="preserve"> starfish.</w:t>
       </w:r>
     </w:p>
     <w:p>
@@ -1182,7 +1137,7 @@
         <w:pStyle w:val="ListParagraph"/>
         <w:numPr>
           <w:ilvl w:val="0"/>
-          <w:numId w:val="4"/>
+          <w:numId w:val="1"/>
         </w:numPr>
         <w:spacing w:before="0" w:after="80"/>
         <w:rPr>
@@ -1195,28 +1150,14 @@
           <w:b/>
           <w:bCs/>
         </w:rPr>
-        <w:t>¿</w:t>
-      </w:r>
-      <w:r>
-        <w:rPr>
-          <w:b/>
-          <w:bCs/>
-        </w:rPr>
-        <w:t xml:space="preserve">Cuáles no? </w:t>
-      </w:r>
-      <w:r>
-        <w:rPr>
-          <w:b/>
-          <w:bCs/>
-        </w:rPr>
-        <w:t>Las cuatro restantes</w:t>
-      </w:r>
-      <w:r>
-        <w:rPr>
-          <w:b/>
-          <w:bCs/>
-        </w:rPr>
-        <w:t>.</w:t>
+        <w:t xml:space="preserve">¿Cuáles no? </w:t>
+      </w:r>
+      <w:r>
+        <w:rPr>
+          <w:b w:val="false"/>
+          <w:bCs w:val="false"/>
+        </w:rPr>
+        <w:t>Las cuatro restantes.</w:t>
       </w:r>
     </w:p>
     <w:p>
@@ -1224,7 +1165,7 @@
         <w:pStyle w:val="ListParagraph"/>
         <w:numPr>
           <w:ilvl w:val="0"/>
-          <w:numId w:val="4"/>
+          <w:numId w:val="1"/>
         </w:numPr>
         <w:spacing w:before="0" w:after="80"/>
         <w:rPr/>
@@ -1234,22 +1175,15 @@
           <w:b/>
           <w:bCs/>
         </w:rPr>
-        <w:t>¿</w:t>
-      </w:r>
-      <w:r>
-        <w:rPr>
-          <w:b/>
-          <w:bCs/>
-        </w:rPr>
-        <w:t>Por qué creéis que ocurre?</w:t>
-      </w:r>
-      <w:r>
-        <w:rPr/>
-        <w:t xml:space="preserve"> </w:t>
-      </w:r>
-      <w:r>
-        <w:rPr/>
-        <w:t>Podría ser por longitud o por que las palabras utilizadas para generar el diccionario no han sido las correctas.</w:t>
+        <w:t>¿Por qué creéis que ocurre?</w:t>
+      </w:r>
+      <w:r>
+        <w:rPr/>
+        <w:t xml:space="preserve"> P</w:t>
+      </w:r>
+      <w:r>
+        <w:rPr/>
+        <w:t>or que en el diccionario estará registrada la palabra ya que será bastante común su uso.</w:t>
       </w:r>
     </w:p>
     <w:p>
@@ -1311,14 +1245,14 @@
         <w:tblLook w:val="0000" w:firstRow="0" w:noVBand="0" w:lastRow="0" w:firstColumn="0" w:lastColumn="0" w:noHBand="0"/>
       </w:tblPr>
       <w:tblGrid>
-        <w:gridCol w:w="2998"/>
-        <w:gridCol w:w="6002"/>
+        <w:gridCol w:w="2997"/>
+        <w:gridCol w:w="6003"/>
       </w:tblGrid>
       <w:tr>
         <w:trPr/>
         <w:tc>
           <w:tcPr>
-            <w:tcW w:w="2998" w:type="dxa"/>
+            <w:tcW w:w="2997" w:type="dxa"/>
             <w:tcBorders>
               <w:top w:val="single" w:sz="4" w:space="0" w:color="000000"/>
               <w:start w:val="single" w:sz="4" w:space="0" w:color="000000"/>
@@ -1344,7 +1278,7 @@
         </w:tc>
         <w:tc>
           <w:tcPr>
-            <w:tcW w:w="6002" w:type="dxa"/>
+            <w:tcW w:w="6003" w:type="dxa"/>
             <w:tcBorders>
               <w:top w:val="single" w:sz="4" w:space="0" w:color="000000"/>
               <w:start w:val="single" w:sz="4" w:space="0" w:color="000000"/>
@@ -1373,7 +1307,7 @@
         <w:trPr/>
         <w:tc>
           <w:tcPr>
-            <w:tcW w:w="2998" w:type="dxa"/>
+            <w:tcW w:w="2997" w:type="dxa"/>
             <w:tcBorders>
               <w:top w:val="single" w:sz="4" w:space="0" w:color="000000"/>
               <w:start w:val="single" w:sz="4" w:space="0" w:color="000000"/>
@@ -1396,7 +1330,7 @@
         </w:tc>
         <w:tc>
           <w:tcPr>
-            <w:tcW w:w="6002" w:type="dxa"/>
+            <w:tcW w:w="6003" w:type="dxa"/>
             <w:tcBorders>
               <w:top w:val="single" w:sz="4" w:space="0" w:color="000000"/>
               <w:start w:val="single" w:sz="4" w:space="0" w:color="000000"/>
@@ -1422,7 +1356,7 @@
         <w:trPr/>
         <w:tc>
           <w:tcPr>
-            <w:tcW w:w="2998" w:type="dxa"/>
+            <w:tcW w:w="2997" w:type="dxa"/>
             <w:tcBorders>
               <w:top w:val="single" w:sz="4" w:space="0" w:color="000000"/>
               <w:start w:val="single" w:sz="4" w:space="0" w:color="000000"/>
@@ -1445,7 +1379,7 @@
         </w:tc>
         <w:tc>
           <w:tcPr>
-            <w:tcW w:w="6002" w:type="dxa"/>
+            <w:tcW w:w="6003" w:type="dxa"/>
             <w:tcBorders>
               <w:top w:val="single" w:sz="4" w:space="0" w:color="000000"/>
               <w:start w:val="single" w:sz="4" w:space="0" w:color="000000"/>
@@ -1471,7 +1405,7 @@
         <w:trPr/>
         <w:tc>
           <w:tcPr>
-            <w:tcW w:w="2998" w:type="dxa"/>
+            <w:tcW w:w="2997" w:type="dxa"/>
             <w:tcBorders>
               <w:top w:val="single" w:sz="4" w:space="0" w:color="000000"/>
               <w:start w:val="single" w:sz="4" w:space="0" w:color="000000"/>
@@ -1494,7 +1428,7 @@
         </w:tc>
         <w:tc>
           <w:tcPr>
-            <w:tcW w:w="6002" w:type="dxa"/>
+            <w:tcW w:w="6003" w:type="dxa"/>
             <w:tcBorders>
               <w:top w:val="single" w:sz="4" w:space="0" w:color="000000"/>
               <w:start w:val="single" w:sz="4" w:space="0" w:color="000000"/>
@@ -1520,7 +1454,7 @@
         <w:trPr/>
         <w:tc>
           <w:tcPr>
-            <w:tcW w:w="2998" w:type="dxa"/>
+            <w:tcW w:w="2997" w:type="dxa"/>
             <w:tcBorders>
               <w:top w:val="single" w:sz="4" w:space="0" w:color="000000"/>
               <w:start w:val="single" w:sz="4" w:space="0" w:color="000000"/>
@@ -1543,7 +1477,7 @@
         </w:tc>
         <w:tc>
           <w:tcPr>
-            <w:tcW w:w="6002" w:type="dxa"/>
+            <w:tcW w:w="6003" w:type="dxa"/>
             <w:tcBorders>
               <w:top w:val="single" w:sz="4" w:space="0" w:color="000000"/>
               <w:start w:val="single" w:sz="4" w:space="0" w:color="000000"/>
@@ -1814,7 +1748,7 @@
         <w:pStyle w:val="ListParagraph"/>
         <w:numPr>
           <w:ilvl w:val="0"/>
-          <w:numId w:val="4"/>
+          <w:numId w:val="1"/>
         </w:numPr>
         <w:spacing w:before="0" w:after="80"/>
         <w:rPr/>
@@ -1829,7 +1763,7 @@
         <w:pStyle w:val="ListParagraph"/>
         <w:numPr>
           <w:ilvl w:val="0"/>
-          <w:numId w:val="4"/>
+          <w:numId w:val="1"/>
         </w:numPr>
         <w:spacing w:before="0" w:after="80"/>
         <w:rPr/>
@@ -1844,7 +1778,7 @@
         <w:pStyle w:val="ListParagraph"/>
         <w:numPr>
           <w:ilvl w:val="0"/>
-          <w:numId w:val="4"/>
+          <w:numId w:val="1"/>
         </w:numPr>
         <w:spacing w:before="0" w:after="80"/>
         <w:rPr/>
@@ -1859,7 +1793,7 @@
         <w:pStyle w:val="ListParagraph"/>
         <w:numPr>
           <w:ilvl w:val="0"/>
-          <w:numId w:val="4"/>
+          <w:numId w:val="1"/>
         </w:numPr>
         <w:spacing w:before="0" w:after="80"/>
         <w:rPr/>
@@ -2135,11 +2069,33 @@
           <w:numId w:val="10"/>
         </w:numPr>
         <w:spacing w:before="0" w:after="80"/>
-        <w:rPr/>
-      </w:pPr>
-      <w:r>
-        <w:rPr/>
+        <w:rPr>
+          <w:b/>
+          <w:bCs/>
+        </w:rPr>
+      </w:pPr>
+      <w:r>
+        <w:rPr>
+          <w:b/>
+          <w:bCs/>
+        </w:rPr>
         <w:t>¿Qué diferencia habéis observado entre utilizar un diccionario pequeño y rockyou.txt?</w:t>
+      </w:r>
+    </w:p>
+    <w:p>
+      <w:pPr>
+        <w:pStyle w:val="ListParagraph"/>
+        <w:numPr>
+          <w:ilvl w:val="0"/>
+          <w:numId w:val="0"/>
+        </w:numPr>
+        <w:spacing w:before="0" w:after="80"/>
+        <w:ind w:hanging="0" w:start="420"/>
+        <w:rPr/>
+      </w:pPr>
+      <w:r>
+        <w:rPr/>
+        <w:t>El diccionario pequeño puede permitir que con las palabras que tu añades, conociendo a la persona, genere combinaciones y pueda ser más eficaz. Sin embargo, con uno más grande, te aseguras de que en caso de usar contraseñas genéricas o comunes, será más fácil el acceso.</w:t>
       </w:r>
     </w:p>
     <w:p>
@@ -2195,11 +2151,33 @@
           <w:numId w:val="6"/>
         </w:numPr>
         <w:spacing w:before="0" w:after="80"/>
-        <w:rPr/>
-      </w:pPr>
-      <w:r>
-        <w:rPr/>
+        <w:rPr>
+          <w:b/>
+          <w:bCs/>
+        </w:rPr>
+      </w:pPr>
+      <w:r>
+        <w:rPr>
+          <w:b/>
+          <w:bCs/>
+        </w:rPr>
         <w:t>¿Por qué una contraseña poco habitual dificulta un ataque basado únicamente en diccionarios?</w:t>
+      </w:r>
+    </w:p>
+    <w:p>
+      <w:pPr>
+        <w:pStyle w:val="ListParagraph"/>
+        <w:numPr>
+          <w:ilvl w:val="0"/>
+          <w:numId w:val="0"/>
+        </w:numPr>
+        <w:spacing w:before="0" w:after="80"/>
+        <w:ind w:hanging="0" w:start="420"/>
+        <w:rPr/>
+      </w:pPr>
+      <w:r>
+        <w:rPr/>
+        <w:t>Por que cuanto más compleja la contraseña, más poco probable es que esté en un diccionario.</w:t>
       </w:r>
     </w:p>
     <w:p>
@@ -2210,33 +2188,17 @@
           <w:numId w:val="6"/>
         </w:numPr>
         <w:spacing w:before="0" w:after="80"/>
-        <w:rPr/>
-      </w:pPr>
-      <w:r>
-        <w:rPr/>
+        <w:rPr>
+          <w:b/>
+          <w:bCs/>
+        </w:rPr>
+      </w:pPr>
+      <w:r>
+        <w:rPr>
+          <w:b/>
+          <w:bCs/>
+        </w:rPr>
         <w:t>Proponed una contraseña para el punto de acceso que consideréis más resistente y explicad qué características la hacen mejor.</w:t>
-      </w:r>
-    </w:p>
-    <w:p>
-      <w:pPr>
-        <w:pStyle w:val="Heading1"/>
-        <w:spacing w:before="400" w:after="200"/>
-        <w:rPr/>
-      </w:pPr>
-      <w:r>
-        <w:rPr/>
-        <w:t>Entrega</w:t>
-      </w:r>
-    </w:p>
-    <w:p>
-      <w:pPr>
-        <w:pStyle w:val="Normal"/>
-        <w:spacing w:before="0" w:after="150"/>
-        <w:rPr/>
-      </w:pPr>
-      <w:r>
-        <w:rPr/>
-        <w:t>Entregad un único PDF por pareja, con los nombres de ambos integrantes, que incluya:</w:t>
       </w:r>
     </w:p>
     <w:p>
@@ -2244,14 +2206,44 @@
         <w:pStyle w:val="ListParagraph"/>
         <w:numPr>
           <w:ilvl w:val="0"/>
-          <w:numId w:val="4"/>
+          <w:numId w:val="0"/>
         </w:numPr>
         <w:spacing w:before="0" w:after="80"/>
-        <w:rPr/>
-      </w:pPr>
-      <w:r>
-        <w:rPr/>
-        <w:t>Los tres hashes utilizados.</w:t>
+        <w:ind w:hanging="0" w:start="420"/>
+        <w:rPr/>
+      </w:pPr>
+      <w:r>
+        <w:rPr>
+          <w:i/>
+          <w:iCs/>
+        </w:rPr>
+        <w:t>MeGustanMuchoLasPatatas</w:t>
+      </w:r>
+      <w:r>
+        <w:rPr/>
+        <w:t xml:space="preserve"> Esta contraseña, lo que la hace mejor es que es más larga, consta de mayúsculas y minúsculas y como extra, que sea una frase. Al ser una frase con sentido es más complejo que con diccionarios generados se creen.</w:t>
+      </w:r>
+    </w:p>
+    <w:p>
+      <w:pPr>
+        <w:pStyle w:val="Heading1"/>
+        <w:spacing w:before="400" w:after="200"/>
+        <w:rPr/>
+      </w:pPr>
+      <w:r>
+        <w:rPr/>
+        <w:t>Entrega</w:t>
+      </w:r>
+    </w:p>
+    <w:p>
+      <w:pPr>
+        <w:pStyle w:val="Normal"/>
+        <w:spacing w:before="0" w:after="150"/>
+        <w:rPr/>
+      </w:pPr>
+      <w:r>
+        <w:rPr/>
+        <w:t>Entregad un único PDF por pareja, con los nombres de ambos integrantes, que incluya:</w:t>
       </w:r>
     </w:p>
     <w:p>
@@ -2259,14 +2251,14 @@
         <w:pStyle w:val="ListParagraph"/>
         <w:numPr>
           <w:ilvl w:val="0"/>
-          <w:numId w:val="4"/>
+          <w:numId w:val="1"/>
         </w:numPr>
         <w:spacing w:before="0" w:after="80"/>
         <w:rPr/>
       </w:pPr>
       <w:r>
         <w:rPr/>
-        <w:t>Una captura de pantalla del contenido de vuestro diccionario.txt.</w:t>
+        <w:t>Los tres hashes utilizados.</w:t>
       </w:r>
     </w:p>
     <w:p>
@@ -2274,14 +2266,14 @@
         <w:pStyle w:val="ListParagraph"/>
         <w:numPr>
           <w:ilvl w:val="0"/>
-          <w:numId w:val="4"/>
+          <w:numId w:val="1"/>
         </w:numPr>
         <w:spacing w:before="0" w:after="80"/>
         <w:rPr/>
       </w:pPr>
       <w:r>
         <w:rPr/>
-        <w:t>Captura de pantalla del ataque con Hashcat de la Parte 1.</w:t>
+        <w:t>Una captura de pantalla del contenido de vuestro diccionario.txt.</w:t>
       </w:r>
     </w:p>
     <w:p>
@@ -2289,14 +2281,14 @@
         <w:pStyle w:val="ListParagraph"/>
         <w:numPr>
           <w:ilvl w:val="0"/>
-          <w:numId w:val="4"/>
+          <w:numId w:val="1"/>
         </w:numPr>
         <w:spacing w:before="0" w:after="80"/>
         <w:rPr/>
       </w:pPr>
       <w:r>
         <w:rPr/>
-        <w:t>Nombre del SSID creado para la práctica.</w:t>
+        <w:t>Captura de pantalla del ataque con Hashcat de la Parte 1.</w:t>
       </w:r>
     </w:p>
     <w:p>
@@ -2304,14 +2296,14 @@
         <w:pStyle w:val="ListParagraph"/>
         <w:numPr>
           <w:ilvl w:val="0"/>
-          <w:numId w:val="4"/>
+          <w:numId w:val="1"/>
         </w:numPr>
         <w:spacing w:before="0" w:after="80"/>
         <w:rPr/>
       </w:pPr>
       <w:r>
         <w:rPr/>
-        <w:t>Captura de pantalla del comando de deauth y de la confirmación del handshake en airodump-ng.</w:t>
+        <w:t>Nombre del SSID creado para la práctica.</w:t>
       </w:r>
     </w:p>
     <w:p>
@@ -2319,14 +2311,14 @@
         <w:pStyle w:val="ListParagraph"/>
         <w:numPr>
           <w:ilvl w:val="0"/>
-          <w:numId w:val="4"/>
+          <w:numId w:val="1"/>
         </w:numPr>
         <w:spacing w:before="0" w:after="80"/>
         <w:rPr/>
       </w:pPr>
       <w:r>
         <w:rPr/>
-        <w:t>Captura de pantalla del archivo wifi.22000 generado.</w:t>
+        <w:t>Captura de pantalla del comando de deauth y de la confirmación del handshake en airodump-ng.</w:t>
       </w:r>
     </w:p>
     <w:p>
@@ -2334,14 +2326,14 @@
         <w:pStyle w:val="ListParagraph"/>
         <w:numPr>
           <w:ilvl w:val="0"/>
-          <w:numId w:val="4"/>
+          <w:numId w:val="1"/>
         </w:numPr>
         <w:spacing w:before="0" w:after="80"/>
         <w:rPr/>
       </w:pPr>
       <w:r>
         <w:rPr/>
-        <w:t>Captura de pantalla del ataque de Hashcat contra vuestro propio punto de acceso.</w:t>
+        <w:t>Captura de pantalla del archivo wifi.22000 generado.</w:t>
       </w:r>
     </w:p>
     <w:p>
@@ -2349,14 +2341,14 @@
         <w:pStyle w:val="ListParagraph"/>
         <w:numPr>
           <w:ilvl w:val="0"/>
-          <w:numId w:val="4"/>
+          <w:numId w:val="1"/>
         </w:numPr>
         <w:spacing w:before="0" w:after="80"/>
         <w:rPr/>
       </w:pPr>
       <w:r>
         <w:rPr/>
-        <w:t>Respuestas a todas las preguntas.</w:t>
+        <w:t>Captura de pantalla del ataque de Hashcat contra vuestro propio punto de acceso.</w:t>
       </w:r>
     </w:p>
     <w:p>
@@ -2364,7 +2356,22 @@
         <w:pStyle w:val="ListParagraph"/>
         <w:numPr>
           <w:ilvl w:val="0"/>
-          <w:numId w:val="4"/>
+          <w:numId w:val="1"/>
+        </w:numPr>
+        <w:spacing w:before="0" w:after="80"/>
+        <w:rPr/>
+      </w:pPr>
+      <w:r>
+        <w:rPr/>
+        <w:t>Respuestas a todas las preguntas.</w:t>
+      </w:r>
+    </w:p>
+    <w:p>
+      <w:pPr>
+        <w:pStyle w:val="ListParagraph"/>
+        <w:numPr>
+          <w:ilvl w:val="0"/>
+          <w:numId w:val="1"/>
         </w:numPr>
         <w:spacing w:before="0" w:after="80"/>
         <w:rPr/>
@@ -2756,117 +2763,133 @@
       <w:lvlJc w:val="start"/>
       <w:pPr>
         <w:tabs>
-          <w:tab w:val="num" w:pos="0"/>
-        </w:tabs>
-        <w:ind w:start="420" w:hanging="260"/>
+          <w:tab w:val="num" w:pos="720"/>
+        </w:tabs>
+        <w:ind w:start="720" w:hanging="360"/>
       </w:pPr>
       <w:rPr>
         <w:rFonts w:ascii="Symbol" w:hAnsi="Symbol" w:cs="Symbol" w:hint="default"/>
       </w:rPr>
     </w:lvl>
     <w:lvl w:ilvl="1">
-      <w:start w:val="0"/>
-      <w:numFmt w:val="decimal"/>
-      <w:lvlText w:val=""/>
-      <w:lvlJc w:val="start"/>
-      <w:pPr>
-        <w:tabs>
-          <w:tab w:val="num" w:pos="0"/>
-        </w:tabs>
-        <w:ind w:start="0" w:hanging="0"/>
-      </w:pPr>
-      <w:rPr/>
+      <w:start w:val="1"/>
+      <w:numFmt w:val="bullet"/>
+      <w:lvlText w:val="◦"/>
+      <w:lvlJc w:val="start"/>
+      <w:pPr>
+        <w:tabs>
+          <w:tab w:val="num" w:pos="1080"/>
+        </w:tabs>
+        <w:ind w:start="1080" w:hanging="360"/>
+      </w:pPr>
+      <w:rPr>
+        <w:rFonts w:ascii="OpenSymbol" w:hAnsi="OpenSymbol" w:cs="OpenSymbol" w:hint="default"/>
+      </w:rPr>
     </w:lvl>
     <w:lvl w:ilvl="2">
-      <w:start w:val="0"/>
-      <w:numFmt w:val="decimal"/>
-      <w:lvlText w:val=""/>
-      <w:lvlJc w:val="start"/>
-      <w:pPr>
-        <w:tabs>
-          <w:tab w:val="num" w:pos="0"/>
-        </w:tabs>
-        <w:ind w:start="0" w:hanging="0"/>
-      </w:pPr>
-      <w:rPr/>
+      <w:start w:val="1"/>
+      <w:numFmt w:val="bullet"/>
+      <w:lvlText w:val="▪"/>
+      <w:lvlJc w:val="start"/>
+      <w:pPr>
+        <w:tabs>
+          <w:tab w:val="num" w:pos="1440"/>
+        </w:tabs>
+        <w:ind w:start="1440" w:hanging="360"/>
+      </w:pPr>
+      <w:rPr>
+        <w:rFonts w:ascii="OpenSymbol" w:hAnsi="OpenSymbol" w:cs="OpenSymbol" w:hint="default"/>
+      </w:rPr>
     </w:lvl>
     <w:lvl w:ilvl="3">
-      <w:start w:val="0"/>
-      <w:numFmt w:val="decimal"/>
-      <w:lvlText w:val=""/>
-      <w:lvlJc w:val="start"/>
-      <w:pPr>
-        <w:tabs>
-          <w:tab w:val="num" w:pos="0"/>
-        </w:tabs>
-        <w:ind w:start="0" w:hanging="0"/>
-      </w:pPr>
-      <w:rPr/>
+      <w:start w:val="1"/>
+      <w:numFmt w:val="bullet"/>
+      <w:lvlText w:val=""/>
+      <w:lvlJc w:val="start"/>
+      <w:pPr>
+        <w:tabs>
+          <w:tab w:val="num" w:pos="1800"/>
+        </w:tabs>
+        <w:ind w:start="1800" w:hanging="360"/>
+      </w:pPr>
+      <w:rPr>
+        <w:rFonts w:ascii="Symbol" w:hAnsi="Symbol" w:cs="Symbol" w:hint="default"/>
+      </w:rPr>
     </w:lvl>
     <w:lvl w:ilvl="4">
-      <w:start w:val="0"/>
-      <w:numFmt w:val="decimal"/>
-      <w:lvlText w:val=""/>
-      <w:lvlJc w:val="start"/>
-      <w:pPr>
-        <w:tabs>
-          <w:tab w:val="num" w:pos="0"/>
-        </w:tabs>
-        <w:ind w:start="0" w:hanging="0"/>
-      </w:pPr>
-      <w:rPr/>
+      <w:start w:val="1"/>
+      <w:numFmt w:val="bullet"/>
+      <w:lvlText w:val="◦"/>
+      <w:lvlJc w:val="start"/>
+      <w:pPr>
+        <w:tabs>
+          <w:tab w:val="num" w:pos="2160"/>
+        </w:tabs>
+        <w:ind w:start="2160" w:hanging="360"/>
+      </w:pPr>
+      <w:rPr>
+        <w:rFonts w:ascii="OpenSymbol" w:hAnsi="OpenSymbol" w:cs="OpenSymbol" w:hint="default"/>
+      </w:rPr>
     </w:lvl>
     <w:lvl w:ilvl="5">
-      <w:start w:val="0"/>
-      <w:numFmt w:val="decimal"/>
-      <w:lvlText w:val=""/>
-      <w:lvlJc w:val="start"/>
-      <w:pPr>
-        <w:tabs>
-          <w:tab w:val="num" w:pos="0"/>
-        </w:tabs>
-        <w:ind w:start="0" w:hanging="0"/>
-      </w:pPr>
-      <w:rPr/>
+      <w:start w:val="1"/>
+      <w:numFmt w:val="bullet"/>
+      <w:lvlText w:val="▪"/>
+      <w:lvlJc w:val="start"/>
+      <w:pPr>
+        <w:tabs>
+          <w:tab w:val="num" w:pos="2520"/>
+        </w:tabs>
+        <w:ind w:start="2520" w:hanging="360"/>
+      </w:pPr>
+      <w:rPr>
+        <w:rFonts w:ascii="OpenSymbol" w:hAnsi="OpenSymbol" w:cs="OpenSymbol" w:hint="default"/>
+      </w:rPr>
     </w:lvl>
     <w:lvl w:ilvl="6">
-      <w:start w:val="0"/>
-      <w:numFmt w:val="decimal"/>
-      <w:lvlText w:val=""/>
-      <w:lvlJc w:val="start"/>
-      <w:pPr>
-        <w:tabs>
-          <w:tab w:val="num" w:pos="0"/>
-        </w:tabs>
-        <w:ind w:start="0" w:hanging="0"/>
-      </w:pPr>
-      <w:rPr/>
+      <w:start w:val="1"/>
+      <w:numFmt w:val="bullet"/>
+      <w:lvlText w:val=""/>
+      <w:lvlJc w:val="start"/>
+      <w:pPr>
+        <w:tabs>
+          <w:tab w:val="num" w:pos="2880"/>
+        </w:tabs>
+        <w:ind w:start="2880" w:hanging="360"/>
+      </w:pPr>
+      <w:rPr>
+        <w:rFonts w:ascii="Symbol" w:hAnsi="Symbol" w:cs="Symbol" w:hint="default"/>
+      </w:rPr>
     </w:lvl>
     <w:lvl w:ilvl="7">
-      <w:start w:val="0"/>
-      <w:numFmt w:val="decimal"/>
-      <w:lvlText w:val=""/>
-      <w:lvlJc w:val="start"/>
-      <w:pPr>
-        <w:tabs>
-          <w:tab w:val="num" w:pos="0"/>
-        </w:tabs>
-        <w:ind w:start="0" w:hanging="0"/>
-      </w:pPr>
-      <w:rPr/>
+      <w:start w:val="1"/>
+      <w:numFmt w:val="bullet"/>
+      <w:lvlText w:val="◦"/>
+      <w:lvlJc w:val="start"/>
+      <w:pPr>
+        <w:tabs>
+          <w:tab w:val="num" w:pos="3240"/>
+        </w:tabs>
+        <w:ind w:start="3240" w:hanging="360"/>
+      </w:pPr>
+      <w:rPr>
+        <w:rFonts w:ascii="OpenSymbol" w:hAnsi="OpenSymbol" w:cs="OpenSymbol" w:hint="default"/>
+      </w:rPr>
     </w:lvl>
     <w:lvl w:ilvl="8">
-      <w:start w:val="0"/>
-      <w:numFmt w:val="decimal"/>
-      <w:lvlText w:val=""/>
-      <w:lvlJc w:val="start"/>
-      <w:pPr>
-        <w:tabs>
-          <w:tab w:val="num" w:pos="0"/>
-        </w:tabs>
-        <w:ind w:start="0" w:hanging="0"/>
-      </w:pPr>
-      <w:rPr/>
+      <w:start w:val="1"/>
+      <w:numFmt w:val="bullet"/>
+      <w:lvlText w:val="▪"/>
+      <w:lvlJc w:val="start"/>
+      <w:pPr>
+        <w:tabs>
+          <w:tab w:val="num" w:pos="3600"/>
+        </w:tabs>
+        <w:ind w:start="3600" w:hanging="360"/>
+      </w:pPr>
+      <w:rPr>
+        <w:rFonts w:ascii="OpenSymbol" w:hAnsi="OpenSymbol" w:cs="OpenSymbol" w:hint="default"/>
+      </w:rPr>
     </w:lvl>
   </w:abstractNum>
   <w:abstractNum w:abstractNumId="5">
@@ -3967,8 +3990,8 @@
       <w:u w:val="single"/>
     </w:rPr>
   </w:style>
-  <w:style w:type="character" w:styleId="Caracteresdenotaalpieuser">
-    <w:name w:val="Caracteres de nota al pie (user)"/>
+  <w:style w:type="character" w:styleId="Caracteresdenotaalpie">
+    <w:name w:val="Caracteres de nota al pie"/>
     <w:uiPriority w:val="99"/>
     <w:semiHidden/>
     <w:unhideWhenUsed/>
@@ -3976,8 +3999,8 @@
       <w:vertAlign w:val="superscript"/>
     </w:rPr>
   </w:style>
-  <w:style w:type="character" w:styleId="Caracteresdenotaalpie">
-    <w:name w:val="Caracteres de nota al pie"/>
+  <w:style w:type="character" w:styleId="Caracteresdenotaalpieuser">
+    <w:name w:val="Caracteres de nota al pie (user)"/>
     <w:rPr>
       <w:vertAlign w:val="superscript"/>
     </w:rPr>
@@ -3998,8 +4021,8 @@
       <w:szCs w:val="20"/>
     </w:rPr>
   </w:style>
-  <w:style w:type="character" w:styleId="Caracteresdenotafinaluser">
-    <w:name w:val="Caracteres de nota final (user)"/>
+  <w:style w:type="character" w:styleId="Caracteresdenotafinal">
+    <w:name w:val="Caracteres de nota final"/>
     <w:uiPriority w:val="99"/>
     <w:semiHidden/>
     <w:unhideWhenUsed/>
@@ -4007,8 +4030,8 @@
       <w:vertAlign w:val="superscript"/>
     </w:rPr>
   </w:style>
-  <w:style w:type="character" w:styleId="Caracteresdenotafinal">
-    <w:name w:val="Caracteres de nota final"/>
+  <w:style w:type="character" w:styleId="Caracteresdenotafinaluser">
+    <w:name w:val="Caracteres de nota final (user)"/>
     <w:rPr>
       <w:vertAlign w:val="superscript"/>
     </w:rPr>
@@ -4027,6 +4050,12 @@
     <w:rPr>
       <w:sz w:val="20"/>
       <w:szCs w:val="20"/>
+    </w:rPr>
+  </w:style>
+  <w:style w:type="character" w:styleId="Bolosuser">
+    <w:name w:val="Bolos (user)"/>
+    <w:rPr>
+      <w:rFonts w:ascii="OpenSymbol" w:hAnsi="OpenSymbol" w:eastAsia="OpenSymbol" w:cs="OpenSymbol"/>
     </w:rPr>
   </w:style>
   <w:style w:type="character" w:styleId="Bolos">
@@ -4218,8 +4247,8 @@
       <w:lang w:val="es-ES" w:eastAsia="es-ES" w:bidi="ar-SA"/>
     </w:rPr>
   </w:style>
-  <w:style w:type="numbering" w:styleId="Ningunalistauser" w:default="1">
-    <w:name w:val="Ninguna lista (user)"/>
+  <w:style w:type="numbering" w:styleId="Ningunalista" w:default="1">
+    <w:name w:val="Ninguna lista"/>
     <w:uiPriority w:val="99"/>
     <w:semiHidden/>
     <w:unhideWhenUsed/>

</xml_diff>